<commit_message>
Report: state Objective 2 met by B5 (90.0%) and B3-Extractive (92.5%)
The previous wording under-claimed B5. At 90.0% answer rate B5 does
meet the >= 85% answer-rate target; the report now says so
explicitly. Table 4.12 row 2 status now reads "Met by B5 (90.0%) and
B3-Extractive (92.5%); not met by B3-Generative or B4". The Table
4.12 abstention row records that B5 also meets the 80% abstention
target at 84.6%, with the 95% CI [61.5%, 100%] flagged as wide due
to n=13 unanswerable queries.

The Sec 4.13 narrative is updated in parallel: B5 is identified as
the stronger final configuration because it meets the answer-rate
target while preserving abstention, citation-precision and
surfaced-grounding floors. Recall@5 remains a near miss.

Body still fits in 30 pages with List of References at body p.31;
prose tightened in Sec 5.3 to absorb the table wording change.
</commit_message>
<xml_diff>
--- a/docs/report/build_assets/Final_Report_Nathaniel_Sebastian_201715051.docx
+++ b/docs/report/build_assets/Final_Report_Nathaniel_Sebastian_201715051.docx
@@ -19472,7 +19472,7 @@
                 <w:color w:val="000000"/>
                 <w:sz w:val="18"/>
               </w:rPr>
-              <w:t xml:space="preserve">Met by B3-Extractive (92.5%); substantially closed by B5 (90.0%) under all safety floors</w:t>
+              <w:t xml:space="preserve">Met by B5 (90.0%) and B3-Extractive (92.5%); not met by B3-Generative or B4</w:t>
             </w:r>
           </w:p>
         </w:tc>
@@ -19570,7 +19570,7 @@
                 <w:color w:val="000000"/>
                 <w:sz w:val="18"/>
               </w:rPr>
-              <w:t xml:space="preserve">Close to target; CI overlaps 80%</w:t>
+              <w:t xml:space="preserve">Near miss; CI overlaps 80%</w:t>
             </w:r>
           </w:p>
         </w:tc>
@@ -19644,31 +19644,31 @@
                 <w:color w:val="000000"/>
                 <w:sz w:val="18"/>
               </w:rPr>
-              <w:t xml:space="preserve">100% (Gen/B4, all-split, n=13 unanswerable); 76.9% (Ext, hybrid, all-split)</w:t>
-            </w:r>
-          </w:p>
-        </w:tc>
-        <w:tc>
-          <w:tcPr>
-            <w:tcMar>
-              <w:top w:w="60" w:type="dxa"/>
-              <w:bottom w:w="60" w:type="dxa"/>
-              <w:left w:w="100" w:type="dxa"/>
-              <w:right w:w="100" w:type="dxa"/>
-            </w:tcMar>
-          </w:tcPr>
-          <w:p>
-            <w:pPr>
-              <w:spacing w:line="276" w:lineRule="auto" w:before="0" w:after="0"/>
-              <w:jc w:val="left"/>
-            </w:pPr>
-            <w:r>
-              <w:rPr>
-                <w:rFonts w:ascii="Times New Roman" w:hAnsi="Times New Roman"/>
-                <w:color w:val="000000"/>
-                <w:sz w:val="18"/>
-              </w:rPr>
-              <w:t xml:space="preserve">Met in Gen and B4; Ext just below</w:t>
+              <w:t xml:space="preserve">100% (Gen/B4); 84.6% (B5, CI95 [61.5%, 100%]); 76.9% (Ext)</w:t>
+            </w:r>
+          </w:p>
+        </w:tc>
+        <w:tc>
+          <w:tcPr>
+            <w:tcMar>
+              <w:top w:w="60" w:type="dxa"/>
+              <w:bottom w:w="60" w:type="dxa"/>
+              <w:left w:w="100" w:type="dxa"/>
+              <w:right w:w="100" w:type="dxa"/>
+            </w:tcMar>
+          </w:tcPr>
+          <w:p>
+            <w:pPr>
+              <w:spacing w:line="276" w:lineRule="auto" w:before="0" w:after="0"/>
+              <w:jc w:val="left"/>
+            </w:pPr>
+            <w:r>
+              <w:rPr>
+                <w:rFonts w:ascii="Times New Roman" w:hAnsi="Times New Roman"/>
+                <w:color w:val="000000"/>
+                <w:sz w:val="18"/>
+              </w:rPr>
+              <w:t xml:space="preserve">Met by Gen, B4 and B5 (B5 wide CI, n=13); Ext just below</w:t>
             </w:r>
           </w:p>
         </w:tc>
@@ -19875,7 +19875,7 @@
         <w:jc w:val="both"/>
       </w:pPr>
       <w:r>
-        <w:t xml:space="preserve">Headline grounding, Critic Mode F1, abstention (for B3-Generative, B4, and B5), and the harness all meet their targets on the corrected v2 set. Objective 2 is met by B3-Extractive on hybrid (92.5%) and substantially closed by B5 Evidence-Gated Hybrid (90.0%) while preserving all safety floors; B4 raises generative-first answer rate from 25% to 50% but does not reach the 85% generative target. Objective 3 reaches 78%, two points below target, with a 95% CI overlapping 80%.</w:t>
+        <w:t xml:space="preserve">Headline grounding, Critic Mode F1, abstention (B3-Generative, B4 and B5), and the harness all meet their targets on the corrected v2 set. Objective 2 is met by B5 Evidence-Gated Hybrid (90.0%) and B3-Extractive on hybrid (92.5%); B5 is the stronger final configuration because it meets the answer-rate target while also preserving the abstention, citation-precision and surfaced-grounding floors. B3-Generative (25%) and B4 (50%) do not reach 85%. Objective 3 reaches 78%, two points below target with a CI overlapping 80%. B5 meets abstention at 84.6% but the CI is wide (n=13).</w:t>
       </w:r>
     </w:p>
     <w:p>
@@ -20089,7 +20089,7 @@
         <w:jc w:val="both"/>
       </w:pPr>
       <w:r>
-        <w:t xml:space="preserve">The limitations above suggest a prioritised future-work programme. The nearest technical step is NLI-based verification, using FEVER-style or SciFact-style entailment models as a backstop for borderline claims (Thorne et al., 2018; Wadden et al., 2020), which directly addresses the heuristic-verification ceiling in L3. The second priority is backend-specific threshold tuning and domain-adapted embeddings, drawing on legal NLP corpora to reduce vocabulary-mismatch failures (Chalkidis et al., 2020). A stronger evaluation would expand the golden set to 200+ annotated queries, compare at least two LLM families, and validate on a real organisational policy corpus with an industry partner. Looking back, designing the evaluation was harder than implementing the reliability features: a safety-first RAG system cannot be judged by answer rate alone, and refusing often had to be reported honestly as both a strength and a limitation.</w:t>
+        <w:t xml:space="preserve">The limitations above suggest a prioritised future-work programme. The nearest technical step is NLI-based verification, using FEVER-style or SciFact-style entailment models as a backstop for borderline claims (Thorne et al., 2018; Wadden et al., 2020), addressing the heuristic-verification ceiling in L3. The second priority is backend-specific threshold tuning and domain-adapted embeddings on legal NLP corpora (Chalkidis et al., 2020). A stronger evaluation would expand the golden set to 200+ queries, compare two LLM families, and validate on a real organisational corpus with an industry partner. Looking back, designing the evaluation was harder than implementing the reliability features themselves: a safety-first RAG system cannot be judged by answer rate alone.</w:t>
       </w:r>
     </w:p>
     <w:bookmarkEnd w:id="86"/>

</xml_diff>